<commit_message>
Expose linked evaluation data and enhance doc UI
Controller: load JSON data from linked evaluation documents (type 8) into evalDoc8DataMap and evalRequestCodeMap and add them to the model (silent try/catch for parsing). Templates: show course and evaluation info from evalDoc8DataMap on the applicant dashboard; add client-side validation in admin doc fragment to check required fields (reportValidity) and disable submit button until required inputs are filled; add floating preview/back buttons (CSS + JS) site-wide in base_academic. Other: remove a temporary docx, update a Phase2 .DS_Store/docx asset and add a user-uploaded PDF in uploads.
</commit_message>
<xml_diff>
--- a/HRCP-KKU-Academic/uploads/academic/position/1/p2doc_1.docx
+++ b/HRCP-KKU-Academic/uploads/academic/position/1/p2doc_1.docx
@@ -612,7 +612,7 @@
           <w:sz w:val="32"/>
           <w:szCs w:val="32"/>
         </w:rPr>
-        <w:t>รองศาสตราจารย์</w:t>
+        <w:t>ศาสตราจารย์</w:t>
       </w:r>
     </w:p>
     <w:p>
@@ -677,7 +677,7 @@
           <w:sz w:val="32"/>
           <w:szCs w:val="32"/>
         </w:rPr>
-        <w:t>วิทยาการคอมพิวเตอร์</w:t>
+        <w:t>กกไ</w:t>
       </w:r>
       <w:r>
         <w:rPr>
@@ -694,7 +694,7 @@
           <w:sz w:val="32"/>
           <w:szCs w:val="32"/>
         </w:rPr>
-        <w:t>ดกหดก</w:t>
+        <w:t>eeeหe</w:t>
       </w:r>
       <w:r>
         <w:rPr>
@@ -731,7 +731,7 @@
           <w:sz w:val="32"/>
           <w:szCs w:val="32"/>
         </w:rPr>
-        <w:t>dsadsdasdsadsadasdasdsadasdasda</w:t>
+        <w:t>eeeาาาไe</w:t>
       </w:r>
       <w:r>
         <w:rPr>
@@ -757,7 +757,7 @@
           <w:sz w:val="32"/>
           <w:szCs w:val="32"/>
         </w:rPr>
-        <w:t>das</w:t>
+        <w:t>กไก</w:t>
       </w:r>
       <w:r>
         <w:rPr>
@@ -794,7 +794,7 @@
           <w:sz w:val="32"/>
           <w:szCs w:val="32"/>
         </w:rPr>
-        <w:t>นายโจ จิ</w:t>
+        <w:t>นายeee3ปป</w:t>
       </w:r>
       <w:r>
         <w:rPr>
@@ -856,7 +856,7 @@
           <w:sz w:val="32"/>
           <w:szCs w:val="32"/>
         </w:rPr>
-        <w:t>dsa</w:t>
+        <w:t>eeeeกก</w:t>
       </w:r>
     </w:p>
     <w:p>
@@ -1050,7 +1050,7 @@
           <w:sz w:val="32"/>
           <w:szCs w:val="32"/>
         </w:rPr>
-        <w:t xml:space="preserve"> dsa</w:t>
+        <w:t xml:space="preserve"> พพ</w:t>
       </w:r>
     </w:p>
     <w:p>
@@ -1096,7 +1096,7 @@
           <w:sz w:val="32"/>
           <w:szCs w:val="32"/>
         </w:rPr>
-        <w:t>dsad</w:t>
+        <w:t>ไกไก</w:t>
       </w:r>
       <w:r>
         <w:rPr>
@@ -1355,7 +1355,7 @@
                 <w:sz w:val="32"/>
                 <w:szCs w:val="32"/>
               </w:rPr>
-              <w:t>dsaxxxxx</w:t>
+              <w:t>กไกไ</w:t>
             </w:r>
             <w:r>
               <w:rPr>
@@ -1379,7 +1379,7 @@
                 <w:sz w:val="32"/>
                 <w:szCs w:val="32"/>
               </w:rPr>
-              <w:t xml:space="preserve"> dsa</w:t>
+              <w:t xml:space="preserve"> กไกไ</w:t>
             </w:r>
             <w:r>
               <w:rPr>
@@ -1417,7 +1417,7 @@
                 <w:sz w:val="32"/>
                 <w:szCs w:val="32"/>
               </w:rPr>
-              <w:t>dsa</w:t>
+              <w:t>กไกไก</w:t>
             </w:r>
             <w:r>
               <w:rPr>
@@ -1455,7 +1455,7 @@
                 <w:sz w:val="32"/>
                 <w:szCs w:val="32"/>
               </w:rPr>
-              <w:t>dsa</w:t>
+              <w:t>กไกก</w:t>
             </w:r>
             <w:r>
               <w:rPr>
@@ -1479,7 +1479,7 @@
                 <w:sz w:val="32"/>
                 <w:szCs w:val="32"/>
               </w:rPr>
-              <w:t xml:space="preserve"> dsa</w:t>
+              <w:t xml:space="preserve"> กไ</w:t>
             </w:r>
             <w:r>
               <w:rPr>
@@ -1667,7 +1667,7 @@
           <w:sz w:val="32"/>
           <w:szCs w:val="32"/>
         </w:rPr>
-        <w:t xml:space="preserve">dsa </w:t>
+        <w:t xml:space="preserve">ผู้ช่วยศาสตราจารย์ </w:t>
       </w:r>
       <w:r>
         <w:rPr>
@@ -1693,7 +1693,7 @@
           <w:sz w:val="32"/>
           <w:szCs w:val="32"/>
         </w:rPr>
-        <w:t>fs</w:t>
+        <w:t/>
       </w:r>
       <w:r>
         <w:rPr>
@@ -1757,7 +1757,7 @@
           <w:sz w:val="32"/>
           <w:szCs w:val="32"/>
         </w:rPr>
-        <w:t>กหฟกหกหฟกหกหฟ</w:t>
+        <w:t/>
       </w:r>
     </w:p>
     <w:p>
@@ -1811,7 +1811,7 @@
           <w:sz w:val="32"/>
           <w:szCs w:val="32"/>
         </w:rPr>
-        <w:t>พิเศษ</w:t>
+        <w:t/>
       </w:r>
       <w:r>
         <w:rPr>
@@ -1862,7 +1862,7 @@
           <w:sz w:val="32"/>
           <w:szCs w:val="32"/>
         </w:rPr>
-        <w:t>fdsfds</w:t>
+        <w:t/>
       </w:r>
       <w:r>
         <w:rPr>
@@ -1922,7 +1922,7 @@
           <w:sz w:val="32"/>
           <w:szCs w:val="32"/>
         </w:rPr>
-        <w:t>ก/-กำไกไำกำไ</w:t>
+        <w:t/>
       </w:r>
       <w:r>
         <w:rPr>
@@ -2002,7 +2002,7 @@
           <w:sz w:val="32"/>
           <w:szCs w:val="32"/>
         </w:rPr>
-        <w:t>พิเศษ</w:t>
+        <w:t/>
       </w:r>
       <w:r>
         <w:rPr>
@@ -2061,7 +2061,7 @@
           <w:sz w:val="32"/>
           <w:szCs w:val="32"/>
         </w:rPr>
-        <w:t>fdsfdsf</w:t>
+        <w:t/>
       </w:r>
       <w:r>
         <w:rPr>
@@ -2122,7 +2122,7 @@
           <w:sz w:val="32"/>
           <w:szCs w:val="32"/>
         </w:rPr>
-        <w:t>ก/-กำไกไำกำไ</w:t>
+        <w:t/>
       </w:r>
     </w:p>
     <w:p>
@@ -2241,7 +2241,7 @@
           <w:sz w:val="32"/>
           <w:szCs w:val="32"/>
         </w:rPr>
-        <w:t xml:space="preserve">das </w:t>
+        <w:t xml:space="preserve">ำำำำ </w:t>
       </w:r>
       <w:r>
         <w:rPr>
@@ -2258,7 +2258,7 @@
           <w:sz w:val="32"/>
           <w:szCs w:val="32"/>
         </w:rPr>
-        <w:t>cdfscds</w:t>
+        <w:t/>
       </w:r>
       <w:r>
         <w:rPr>
@@ -2340,31 +2340,31 @@
           <w:sz w:val="32"/>
           <w:szCs w:val="32"/>
         </w:rPr>
-        <w:t>๑dsadasdas</w:t>
-      </w:r>
-      <w:r>
-        <w:rPr>
-          <w:rFonts w:ascii="TH Sarabun New" w:hAnsi="TH Sarabun New" w:cs="TH Sarabun New"/>
-          <w:sz w:val="32"/>
-          <w:szCs w:val="32"/>
-        </w:rPr>
-        <w:t/>
-      </w:r>
-      <w:r>
-        <w:rPr>
-          <w:rFonts w:ascii="TH Sarabun New" w:hAnsi="TH Sarabun New" w:cs="TH Sarabun New"/>
-          <w:sz w:val="32"/>
-          <w:szCs w:val="32"/>
-        </w:rPr>
-        <w:t/>
-      </w:r>
-      <w:r>
-        <w:rPr>
-          <w:rFonts w:ascii="TH Sarabun New" w:hAnsi="TH Sarabun New" w:cs="TH Sarabun New"/>
-          <w:sz w:val="32"/>
-          <w:szCs w:val="32"/>
-        </w:rPr>
-        <w:t xml:space="preserve"> fdsfds</w:t>
+        <w:t>๑</w:t>
+      </w:r>
+      <w:r>
+        <w:rPr>
+          <w:rFonts w:ascii="TH Sarabun New" w:hAnsi="TH Sarabun New" w:cs="TH Sarabun New"/>
+          <w:sz w:val="32"/>
+          <w:szCs w:val="32"/>
+        </w:rPr>
+        <w:t/>
+      </w:r>
+      <w:r>
+        <w:rPr>
+          <w:rFonts w:ascii="TH Sarabun New" w:hAnsi="TH Sarabun New" w:cs="TH Sarabun New"/>
+          <w:sz w:val="32"/>
+          <w:szCs w:val="32"/>
+        </w:rPr>
+        <w:t/>
+      </w:r>
+      <w:r>
+        <w:rPr>
+          <w:rFonts w:ascii="TH Sarabun New" w:hAnsi="TH Sarabun New" w:cs="TH Sarabun New"/>
+          <w:sz w:val="32"/>
+          <w:szCs w:val="32"/>
+        </w:rPr>
+        <w:t xml:space="preserve"> </w:t>
       </w:r>
       <w:r>
         <w:rPr>
@@ -2532,7 +2532,7 @@
           <w:sz w:val="32"/>
           <w:szCs w:val="32"/>
         </w:rPr>
-        <w:t xml:space="preserve"> fdsfds</w:t>
+        <w:t xml:space="preserve"> </w:t>
       </w:r>
       <w:r>
         <w:rPr>
@@ -2640,10 +2640,10 @@
         <w:tblLook w:val="04A0" w:firstRow="1" w:lastRow="0" w:firstColumn="1" w:lastColumn="0" w:noHBand="0" w:noVBand="1"/>
       </w:tblPr>
       <w:tblGrid>
-        <w:gridCol w:w="1892"/>
-        <w:gridCol w:w="2118"/>
-        <w:gridCol w:w="2984"/>
-        <w:gridCol w:w="2366"/>
+        <w:gridCol w:w="1946"/>
+        <w:gridCol w:w="2145"/>
+        <w:gridCol w:w="2957"/>
+        <w:gridCol w:w="2312"/>
       </w:tblGrid>
       <w:tr>
         <w:tc>
@@ -2760,6 +2760,22 @@
                 <w:sz w:val="32"/>
                 <w:szCs w:val="32"/>
               </w:rPr>
+              <w:t>กไไ</w:t>
+            </w:r>
+            <w:r>
+              <w:rPr>
+                <w:rFonts w:ascii="TH Sarabun New" w:hAnsi="TH Sarabun New" w:cs="TH Sarabun New"/>
+                <w:sz w:val="32"/>
+                <w:szCs w:val="32"/>
+              </w:rPr>
+              <w:t/>
+            </w:r>
+            <w:r>
+              <w:rPr>
+                <w:rFonts w:ascii="TH Sarabun New" w:hAnsi="TH Sarabun New" w:cs="TH Sarabun New"/>
+                <w:sz w:val="32"/>
+                <w:szCs w:val="32"/>
+              </w:rPr>
               <w:t/>
             </w:r>
             <w:r>
@@ -2792,6 +2808,22 @@
                 <w:szCs w:val="32"/>
               </w:rPr>
             </w:pPr>
+            <w:r>
+              <w:rPr>
+                <w:rFonts w:ascii="TH Sarabun New" w:hAnsi="TH Sarabun New" w:cs="TH Sarabun New"/>
+                <w:sz w:val="32"/>
+                <w:szCs w:val="32"/>
+              </w:rPr>
+              <w:t>ไก</w:t>
+            </w:r>
+            <w:r>
+              <w:rPr>
+                <w:rFonts w:ascii="TH Sarabun New" w:hAnsi="TH Sarabun New" w:cs="TH Sarabun New"/>
+                <w:sz w:val="32"/>
+                <w:szCs w:val="32"/>
+              </w:rPr>
+              <w:t/>
+            </w:r>
             <w:r>
               <w:rPr>
                 <w:rFonts w:ascii="TH Sarabun New" w:hAnsi="TH Sarabun New" w:cs="TH Sarabun New"/>
@@ -2836,6 +2868,22 @@
                 <w:sz w:val="32"/>
                 <w:szCs w:val="32"/>
               </w:rPr>
+              <w:t>กไไก</w:t>
+            </w:r>
+            <w:r>
+              <w:rPr>
+                <w:rFonts w:ascii="TH Sarabun New" w:hAnsi="TH Sarabun New" w:cs="TH Sarabun New"/>
+                <w:sz w:val="32"/>
+                <w:szCs w:val="32"/>
+              </w:rPr>
+              <w:t/>
+            </w:r>
+            <w:r>
+              <w:rPr>
+                <w:rFonts w:ascii="TH Sarabun New" w:hAnsi="TH Sarabun New" w:cs="TH Sarabun New"/>
+                <w:sz w:val="32"/>
+                <w:szCs w:val="32"/>
+              </w:rPr>
               <w:t/>
             </w:r>
             <w:r>
@@ -2874,6 +2922,22 @@
                 <w:sz w:val="32"/>
                 <w:szCs w:val="32"/>
               </w:rPr>
+              <w:t>กไก</w:t>
+            </w:r>
+            <w:r>
+              <w:rPr>
+                <w:rFonts w:ascii="TH Sarabun New" w:hAnsi="TH Sarabun New" w:cs="TH Sarabun New"/>
+                <w:sz w:val="32"/>
+                <w:szCs w:val="32"/>
+              </w:rPr>
+              <w:t/>
+            </w:r>
+            <w:r>
+              <w:rPr>
+                <w:rFonts w:ascii="TH Sarabun New" w:hAnsi="TH Sarabun New" w:cs="TH Sarabun New"/>
+                <w:sz w:val="32"/>
+                <w:szCs w:val="32"/>
+              </w:rPr>
               <w:t/>
             </w:r>
             <w:r>
@@ -2957,7 +3021,7 @@
           <w:sz w:val="32"/>
           <w:szCs w:val="32"/>
         </w:rPr>
-        <w:t>fdsfd</w:t>
+        <w:t/>
       </w:r>
     </w:p>
     <w:p>
@@ -3004,7 +3068,7 @@
           <w:sz w:val="32"/>
           <w:szCs w:val="32"/>
         </w:rPr>
-        <w:t>sfdsfds</w:t>
+        <w:t/>
       </w:r>
     </w:p>
     <w:p>
@@ -3051,7 +3115,7 @@
           <w:sz w:val="32"/>
           <w:szCs w:val="32"/>
         </w:rPr>
-        <w:t>fdsfds</w:t>
+        <w:t/>
       </w:r>
     </w:p>
     <w:p>
@@ -3098,8 +3162,7 @@
           <w:sz w:val="32"/>
           <w:szCs w:val="32"/>
         </w:rPr>
-        <w:lastRenderedPageBreak/>
-        <w:t>fdsfds</w:t>
+        <w:t/>
       </w:r>
     </w:p>
     <w:p>
@@ -3360,7 +3423,6 @@
         </w:rPr>
         <w:t/>
       </w:r>
-      <w:proofErr w:type="gramStart"/>
       <w:r>
         <w:rPr>
           <w:rFonts w:ascii="TH Sarabun New" w:hAnsi="TH Sarabun New" w:cs="TH Sarabun New"/>
@@ -3378,7 +3440,6 @@
         </w:rPr>
         <w:t xml:space="preserve">  ไม่เคยใช้</w:t>
       </w:r>
-      <w:proofErr w:type="gramEnd"/>
     </w:p>
     <w:p>
       <w:pPr>
@@ -3439,7 +3500,6 @@
         </w:rPr>
         <w:t/>
       </w:r>
-      <w:proofErr w:type="gramStart"/>
       <w:r>
         <w:rPr>
           <w:rFonts w:ascii="TH Sarabun New" w:hAnsi="TH Sarabun New" w:cs="TH Sarabun New"/>
@@ -3466,7 +3526,6 @@
         </w:rPr>
         <w:t>เคยใช้</w:t>
       </w:r>
-      <w:proofErr w:type="gramEnd"/>
       <w:r>
         <w:rPr>
           <w:rFonts w:ascii="TH Sarabun New" w:hAnsi="TH Sarabun New" w:cs="TH Sarabun New"/>
@@ -3906,7 +3965,6 @@
         </w:rPr>
         <w:t/>
       </w:r>
-      <w:proofErr w:type="gramStart"/>
       <w:r>
         <w:rPr>
           <w:rFonts w:ascii="TH Sarabun New" w:hAnsi="TH Sarabun New" w:cs="TH Sarabun New"/>
@@ -3924,7 +3982,6 @@
         </w:rPr>
         <w:t xml:space="preserve">  ไม่เคยใช้</w:t>
       </w:r>
-      <w:proofErr w:type="gramEnd"/>
     </w:p>
     <w:p>
       <w:pPr>
@@ -3985,7 +4042,6 @@
         </w:rPr>
         <w:t/>
       </w:r>
-      <w:proofErr w:type="gramStart"/>
       <w:r>
         <w:rPr>
           <w:rFonts w:ascii="TH Sarabun New" w:hAnsi="TH Sarabun New" w:cs="TH Sarabun New"/>
@@ -4012,7 +4068,6 @@
         </w:rPr>
         <w:t>เคยใช้</w:t>
       </w:r>
-      <w:proofErr w:type="gramEnd"/>
       <w:r>
         <w:rPr>
           <w:rFonts w:ascii="TH Sarabun New" w:hAnsi="TH Sarabun New" w:cs="TH Sarabun New"/>
@@ -4047,17 +4102,7 @@
           <w:szCs w:val="32"/>
           <w:cs/>
         </w:rPr>
-        <w:t>พ.</w:t>
-      </w:r>
-      <w:proofErr w:type="gramStart"/>
-      <w:r>
-        <w:rPr>
-          <w:rFonts w:ascii="TH Sarabun New" w:hAnsi="TH Sarabun New" w:cs="TH Sarabun New"/>
-          <w:sz w:val="32"/>
-          <w:szCs w:val="32"/>
-          <w:cs/>
-        </w:rPr>
-        <w:t>ศ</w:t>
+        <w:t>พ.ศ</w:t>
       </w:r>
       <w:r>
         <w:rPr>
@@ -4076,7 +4121,6 @@
         </w:rPr>
         <w:t> </w:t>
       </w:r>
-      <w:proofErr w:type="gramEnd"/>
       <w:r>
         <w:rPr>
           <w:rFonts w:ascii="TH Sarabun New" w:hAnsi="TH Sarabun New" w:cs="TH Sarabun New"/>
@@ -4451,7 +4495,6 @@
         </w:rPr>
         <w:t/>
       </w:r>
-      <w:proofErr w:type="gramStart"/>
       <w:r>
         <w:rPr>
           <w:rFonts w:ascii="TH Sarabun New" w:hAnsi="TH Sarabun New" w:cs="TH Sarabun New"/>
@@ -4469,7 +4512,6 @@
         </w:rPr>
         <w:t xml:space="preserve">  ไม่เคยใช้</w:t>
       </w:r>
-      <w:proofErr w:type="gramEnd"/>
     </w:p>
     <w:p>
       <w:pPr>
@@ -4515,7 +4557,6 @@
         </w:rPr>
         <w:t/>
       </w:r>
-      <w:proofErr w:type="gramStart"/>
       <w:r>
         <w:rPr>
           <w:rFonts w:ascii="TH Sarabun New" w:hAnsi="TH Sarabun New" w:cs="TH Sarabun New"/>
@@ -4542,7 +4583,6 @@
         </w:rPr>
         <w:t>เคยใช้</w:t>
       </w:r>
-      <w:proofErr w:type="gramEnd"/>
       <w:r>
         <w:rPr>
           <w:rFonts w:ascii="TH Sarabun New" w:hAnsi="TH Sarabun New" w:cs="TH Sarabun New"/>
@@ -5068,7 +5108,7 @@
           <w:sz w:val="32"/>
           <w:szCs w:val="32"/>
         </w:rPr>
-        <w:t>fdaxxxxxxxxxxxx</w:t>
+        <w:t/>
       </w:r>
       <w:r>
         <w:rPr>
@@ -5152,7 +5192,6 @@
         </w:rPr>
         <w:t/>
       </w:r>
-      <w:proofErr w:type="gramStart"/>
       <w:r>
         <w:rPr>
           <w:rFonts w:ascii="TH Sarabun New" w:hAnsi="TH Sarabun New" w:cs="TH Sarabun New"/>
@@ -5170,7 +5209,6 @@
         </w:rPr>
         <w:t xml:space="preserve">  ไม่เคยใช้</w:t>
       </w:r>
-      <w:proofErr w:type="gramEnd"/>
     </w:p>
     <w:p>
       <w:pPr>
@@ -5215,7 +5253,6 @@
         </w:rPr>
         <w:t/>
       </w:r>
-      <w:proofErr w:type="gramStart"/>
       <w:r>
         <w:rPr>
           <w:rFonts w:ascii="TH Sarabun New" w:hAnsi="TH Sarabun New" w:cs="TH Sarabun New"/>
@@ -5242,7 +5279,6 @@
         </w:rPr>
         <w:t>เคยใช้</w:t>
       </w:r>
-      <w:proofErr w:type="gramEnd"/>
       <w:r>
         <w:rPr>
           <w:rFonts w:ascii="TH Sarabun New" w:hAnsi="TH Sarabun New" w:cs="TH Sarabun New"/>
@@ -5277,17 +5313,7 @@
           <w:szCs w:val="32"/>
           <w:cs/>
         </w:rPr>
-        <w:t>พ.</w:t>
-      </w:r>
-      <w:proofErr w:type="gramStart"/>
-      <w:r>
-        <w:rPr>
-          <w:rFonts w:ascii="TH Sarabun New" w:hAnsi="TH Sarabun New" w:cs="TH Sarabun New"/>
-          <w:sz w:val="32"/>
-          <w:szCs w:val="32"/>
-          <w:cs/>
-        </w:rPr>
-        <w:t>ศ</w:t>
+        <w:t>พ.ศ</w:t>
       </w:r>
       <w:r>
         <w:rPr>
@@ -5306,7 +5332,6 @@
         </w:rPr>
         <w:t xml:space="preserve"> </w:t>
       </w:r>
-      <w:proofErr w:type="gramEnd"/>
       <w:r>
         <w:rPr>
           <w:rFonts w:ascii="TH Sarabun New" w:hAnsi="TH Sarabun New" w:cs="TH Sarabun New"/>
@@ -5505,56 +5530,56 @@
           <w:sz w:val="32"/>
           <w:szCs w:val="32"/>
         </w:rPr>
-        <w:t>hbu</w:t>
-      </w:r>
-      <w:r>
-        <w:rPr>
-          <w:rFonts w:ascii="TH Sarabun New" w:hAnsi="TH Sarabun New" w:cs="TH Sarabun New"/>
-          <w:sz w:val="32"/>
-          <w:szCs w:val="32"/>
-        </w:rPr>
-        <w:t/>
-      </w:r>
-      <w:r>
-        <w:rPr>
-          <w:rFonts w:ascii="TH Sarabun New" w:hAnsi="TH Sarabun New" w:cs="TH Sarabun New"/>
-          <w:sz w:val="32"/>
-          <w:szCs w:val="32"/>
-        </w:rPr>
-        <w:t/>
-      </w:r>
-      <w:r>
-        <w:rPr>
-          <w:rFonts w:ascii="TH Sarabun New" w:hAnsi="TH Sarabun New" w:cs="TH Sarabun New"/>
-          <w:sz w:val="32"/>
-          <w:szCs w:val="32"/>
-        </w:rPr>
-        <w:t/>
-      </w:r>
-      <w:r>
-        <w:rPr>
-          <w:rFonts w:ascii="TH Sarabun New" w:hAnsi="TH Sarabun New" w:cs="TH Sarabun New"/>
-          <w:sz w:val="32"/>
-          <w:szCs w:val="32"/>
-        </w:rPr>
-        <w:t/>
-      </w:r>
-      <w:r>
-        <w:rPr>
-          <w:rFonts w:ascii="TH Sarabun New" w:hAnsi="TH Sarabun New" w:cs="TH Sarabun New"/>
-          <w:sz w:val="32"/>
-          <w:szCs w:val="32"/>
-          <w:cs/>
-        </w:rPr>
-        <w:t xml:space="preserve"> </w:t>
-      </w:r>
-      <w:r>
-        <w:rPr>
-          <w:rFonts w:ascii="TH Sarabun New" w:hAnsi="TH Sarabun New" w:cs="TH Sarabun New"/>
-          <w:sz w:val="32"/>
-          <w:szCs w:val="32"/>
-        </w:rPr>
-        <w:t>bhb</w:t>
+        <w:t>๑</w:t>
+      </w:r>
+      <w:r>
+        <w:rPr>
+          <w:rFonts w:ascii="TH Sarabun New" w:hAnsi="TH Sarabun New" w:cs="TH Sarabun New"/>
+          <w:sz w:val="32"/>
+          <w:szCs w:val="32"/>
+        </w:rPr>
+        <w:t/>
+      </w:r>
+      <w:r>
+        <w:rPr>
+          <w:rFonts w:ascii="TH Sarabun New" w:hAnsi="TH Sarabun New" w:cs="TH Sarabun New"/>
+          <w:sz w:val="32"/>
+          <w:szCs w:val="32"/>
+        </w:rPr>
+        <w:t/>
+      </w:r>
+      <w:r>
+        <w:rPr>
+          <w:rFonts w:ascii="TH Sarabun New" w:hAnsi="TH Sarabun New" w:cs="TH Sarabun New"/>
+          <w:sz w:val="32"/>
+          <w:szCs w:val="32"/>
+        </w:rPr>
+        <w:t/>
+      </w:r>
+      <w:r>
+        <w:rPr>
+          <w:rFonts w:ascii="TH Sarabun New" w:hAnsi="TH Sarabun New" w:cs="TH Sarabun New"/>
+          <w:sz w:val="32"/>
+          <w:szCs w:val="32"/>
+        </w:rPr>
+        <w:t/>
+      </w:r>
+      <w:r>
+        <w:rPr>
+          <w:rFonts w:ascii="TH Sarabun New" w:hAnsi="TH Sarabun New" w:cs="TH Sarabun New"/>
+          <w:sz w:val="32"/>
+          <w:szCs w:val="32"/>
+          <w:cs/>
+        </w:rPr>
+        <w:t xml:space="preserve"> </w:t>
+      </w:r>
+      <w:r>
+        <w:rPr>
+          <w:rFonts w:ascii="TH Sarabun New" w:hAnsi="TH Sarabun New" w:cs="TH Sarabun New"/>
+          <w:sz w:val="32"/>
+          <w:szCs w:val="32"/>
+        </w:rPr>
+        <w:t/>
       </w:r>
       <w:r>
         <w:rPr>
@@ -5704,7 +5729,6 @@
         </w:rPr>
         <w:t/>
       </w:r>
-      <w:proofErr w:type="gramStart"/>
       <w:r>
         <w:rPr>
           <w:rFonts w:ascii="TH Sarabun New" w:hAnsi="TH Sarabun New" w:cs="TH Sarabun New"/>
@@ -5722,7 +5746,6 @@
         </w:rPr>
         <w:t xml:space="preserve">  ไม่เคยใช้</w:t>
       </w:r>
-      <w:proofErr w:type="gramEnd"/>
     </w:p>
     <w:p>
       <w:pPr>
@@ -5782,7 +5805,6 @@
         </w:rPr>
         <w:t/>
       </w:r>
-      <w:proofErr w:type="gramStart"/>
       <w:r>
         <w:rPr>
           <w:rFonts w:ascii="TH Sarabun New" w:hAnsi="TH Sarabun New" w:cs="TH Sarabun New"/>
@@ -5809,7 +5831,6 @@
         </w:rPr>
         <w:t>เคยใช้</w:t>
       </w:r>
-      <w:proofErr w:type="gramEnd"/>
       <w:r>
         <w:rPr>
           <w:rFonts w:ascii="TH Sarabun New" w:hAnsi="TH Sarabun New" w:cs="TH Sarabun New"/>
@@ -5844,17 +5865,7 @@
           <w:szCs w:val="32"/>
           <w:cs/>
         </w:rPr>
-        <w:t>พ.</w:t>
-      </w:r>
-      <w:proofErr w:type="gramStart"/>
-      <w:r>
-        <w:rPr>
-          <w:rFonts w:ascii="TH Sarabun New" w:hAnsi="TH Sarabun New" w:cs="TH Sarabun New"/>
-          <w:sz w:val="32"/>
-          <w:szCs w:val="32"/>
-          <w:cs/>
-        </w:rPr>
-        <w:t>ศ</w:t>
+        <w:t>พ.ศ</w:t>
       </w:r>
       <w:r>
         <w:rPr>
@@ -5864,7 +5875,6 @@
         </w:rPr>
         <w:t>.</w:t>
       </w:r>
-      <w:proofErr w:type="gramEnd"/>
       <w:r>
         <w:rPr>
           <w:rFonts w:ascii="TH Sarabun New" w:hAnsi="TH Sarabun New" w:cs="TH Sarabun New"/>
@@ -6091,56 +6101,56 @@
           <w:sz w:val="32"/>
           <w:szCs w:val="32"/>
         </w:rPr>
-        <w:t>bjb</w:t>
-      </w:r>
-      <w:r>
-        <w:rPr>
-          <w:rFonts w:ascii="TH Sarabun New" w:hAnsi="TH Sarabun New" w:cs="TH Sarabun New"/>
-          <w:sz w:val="32"/>
-          <w:szCs w:val="32"/>
-        </w:rPr>
-        <w:t/>
-      </w:r>
-      <w:r>
-        <w:rPr>
-          <w:rFonts w:ascii="TH Sarabun New" w:hAnsi="TH Sarabun New" w:cs="TH Sarabun New"/>
-          <w:sz w:val="32"/>
-          <w:szCs w:val="32"/>
-        </w:rPr>
-        <w:t/>
-      </w:r>
-      <w:r>
-        <w:rPr>
-          <w:rFonts w:ascii="TH Sarabun New" w:hAnsi="TH Sarabun New" w:cs="TH Sarabun New"/>
-          <w:sz w:val="32"/>
-          <w:szCs w:val="32"/>
-        </w:rPr>
-        <w:t/>
-      </w:r>
-      <w:r>
-        <w:rPr>
-          <w:rFonts w:ascii="TH Sarabun New" w:hAnsi="TH Sarabun New" w:cs="TH Sarabun New"/>
-          <w:sz w:val="32"/>
-          <w:szCs w:val="32"/>
-        </w:rPr>
-        <w:t/>
-      </w:r>
-      <w:r>
-        <w:rPr>
-          <w:rFonts w:ascii="TH Sarabun New" w:hAnsi="TH Sarabun New" w:cs="TH Sarabun New"/>
-          <w:sz w:val="32"/>
-          <w:szCs w:val="32"/>
-          <w:cs/>
-        </w:rPr>
-        <w:t xml:space="preserve"> </w:t>
-      </w:r>
-      <w:r>
-        <w:rPr>
-          <w:rFonts w:ascii="TH Sarabun New" w:hAnsi="TH Sarabun New" w:cs="TH Sarabun New"/>
-          <w:sz w:val="32"/>
-          <w:szCs w:val="32"/>
-        </w:rPr>
-        <w:t>hj</w:t>
+        <w:t>๑</w:t>
+      </w:r>
+      <w:r>
+        <w:rPr>
+          <w:rFonts w:ascii="TH Sarabun New" w:hAnsi="TH Sarabun New" w:cs="TH Sarabun New"/>
+          <w:sz w:val="32"/>
+          <w:szCs w:val="32"/>
+        </w:rPr>
+        <w:t/>
+      </w:r>
+      <w:r>
+        <w:rPr>
+          <w:rFonts w:ascii="TH Sarabun New" w:hAnsi="TH Sarabun New" w:cs="TH Sarabun New"/>
+          <w:sz w:val="32"/>
+          <w:szCs w:val="32"/>
+        </w:rPr>
+        <w:t/>
+      </w:r>
+      <w:r>
+        <w:rPr>
+          <w:rFonts w:ascii="TH Sarabun New" w:hAnsi="TH Sarabun New" w:cs="TH Sarabun New"/>
+          <w:sz w:val="32"/>
+          <w:szCs w:val="32"/>
+        </w:rPr>
+        <w:t/>
+      </w:r>
+      <w:r>
+        <w:rPr>
+          <w:rFonts w:ascii="TH Sarabun New" w:hAnsi="TH Sarabun New" w:cs="TH Sarabun New"/>
+          <w:sz w:val="32"/>
+          <w:szCs w:val="32"/>
+        </w:rPr>
+        <w:t/>
+      </w:r>
+      <w:r>
+        <w:rPr>
+          <w:rFonts w:ascii="TH Sarabun New" w:hAnsi="TH Sarabun New" w:cs="TH Sarabun New"/>
+          <w:sz w:val="32"/>
+          <w:szCs w:val="32"/>
+          <w:cs/>
+        </w:rPr>
+        <w:t xml:space="preserve"> </w:t>
+      </w:r>
+      <w:r>
+        <w:rPr>
+          <w:rFonts w:ascii="TH Sarabun New" w:hAnsi="TH Sarabun New" w:cs="TH Sarabun New"/>
+          <w:sz w:val="32"/>
+          <w:szCs w:val="32"/>
+        </w:rPr>
+        <w:t/>
       </w:r>
       <w:r>
         <w:rPr>
@@ -6274,7 +6284,6 @@
         </w:rPr>
         <w:t/>
       </w:r>
-      <w:proofErr w:type="gramStart"/>
       <w:r>
         <w:rPr>
           <w:rFonts w:ascii="TH Sarabun New" w:hAnsi="TH Sarabun New" w:cs="TH Sarabun New"/>
@@ -6292,7 +6301,6 @@
         </w:rPr>
         <w:t xml:space="preserve">  ไม่เคยใช้</w:t>
       </w:r>
-      <w:proofErr w:type="gramEnd"/>
     </w:p>
     <w:p>
       <w:pPr>
@@ -6337,7 +6345,6 @@
         </w:rPr>
         <w:t/>
       </w:r>
-      <w:proofErr w:type="gramStart"/>
       <w:r>
         <w:rPr>
           <w:rFonts w:ascii="TH Sarabun New" w:hAnsi="TH Sarabun New" w:cs="TH Sarabun New"/>
@@ -6364,7 +6371,6 @@
         </w:rPr>
         <w:t>เคยใช้</w:t>
       </w:r>
-      <w:proofErr w:type="gramEnd"/>
       <w:r>
         <w:rPr>
           <w:rFonts w:ascii="TH Sarabun New" w:hAnsi="TH Sarabun New" w:cs="TH Sarabun New"/>
@@ -6399,17 +6405,7 @@
           <w:szCs w:val="32"/>
           <w:cs/>
         </w:rPr>
-        <w:t>พ.</w:t>
-      </w:r>
-      <w:proofErr w:type="gramStart"/>
-      <w:r>
-        <w:rPr>
-          <w:rFonts w:ascii="TH Sarabun New" w:hAnsi="TH Sarabun New" w:cs="TH Sarabun New"/>
-          <w:sz w:val="32"/>
-          <w:szCs w:val="32"/>
-          <w:cs/>
-        </w:rPr>
-        <w:t>ศ</w:t>
+        <w:t>พ.ศ</w:t>
       </w:r>
       <w:r>
         <w:rPr>
@@ -6428,7 +6424,6 @@
         </w:rPr>
         <w:t/>
       </w:r>
-      <w:proofErr w:type="gramEnd"/>
       <w:r>
         <w:rPr>
           <w:rFonts w:ascii="TH Sarabun New" w:hAnsi="TH Sarabun New" w:cs="TH Sarabun New"/>
@@ -6694,33 +6689,24 @@
           <w:sz w:val="32"/>
           <w:szCs w:val="32"/>
         </w:rPr>
-        <w:t>fds</w:t>
-      </w:r>
-      <w:r>
-        <w:rPr>
-          <w:rFonts w:ascii="TH Sarabun New" w:hAnsi="TH Sarabun New" w:cs="TH Sarabun New"/>
-          <w:sz w:val="32"/>
-          <w:szCs w:val="32"/>
-        </w:rPr>
-        <w:t/>
-      </w:r>
-      <w:r>
-        <w:rPr>
-          <w:rFonts w:ascii="TH Sarabun New" w:hAnsi="TH Sarabun New" w:cs="TH Sarabun New"/>
-          <w:sz w:val="32"/>
-          <w:szCs w:val="32"/>
-        </w:rPr>
-        <w:t/>
-      </w:r>
-      <w:r>
-        <w:rPr>
-          <w:rFonts w:ascii="TH Sarabun New" w:hAnsi="TH Sarabun New" w:cs="TH Sarabun New"/>
-          <w:sz w:val="32"/>
-          <w:szCs w:val="32"/>
-        </w:rPr>
-        <w:t/>
-      </w:r>
-      <w:proofErr w:type="gramStart"/>
+        <w:t/>
+      </w:r>
+      <w:r>
+        <w:rPr>
+          <w:rFonts w:ascii="TH Sarabun New" w:hAnsi="TH Sarabun New" w:cs="TH Sarabun New"/>
+          <w:sz w:val="32"/>
+          <w:szCs w:val="32"/>
+        </w:rPr>
+        <w:t/>
+      </w:r>
+      <w:r>
+        <w:rPr>
+          <w:rFonts w:ascii="TH Sarabun New" w:hAnsi="TH Sarabun New" w:cs="TH Sarabun New"/>
+          <w:sz w:val="32"/>
+          <w:szCs w:val="32"/>
+        </w:rPr>
+        <w:t/>
+      </w:r>
       <w:r>
         <w:rPr>
           <w:rFonts w:ascii="TH Sarabun New" w:hAnsi="TH Sarabun New" w:cs="TH Sarabun New"/>
@@ -6761,9 +6747,8 @@
           <w:sz w:val="32"/>
           <w:szCs w:val="32"/>
         </w:rPr>
-        <w:t>dsdsdsds</w:t>
-      </w:r>
-      <w:proofErr w:type="gramEnd"/>
+        <w:t/>
+      </w:r>
       <w:r>
         <w:rPr>
           <w:rFonts w:ascii="TH Sarabun New" w:hAnsi="TH Sarabun New" w:cs="TH Sarabun New"/>
@@ -6947,7 +6932,6 @@
         </w:rPr>
         <w:t xml:space="preserve">1 </w:t>
       </w:r>
-      <w:proofErr w:type="gramStart"/>
       <w:r>
         <w:rPr>
           <w:rFonts w:ascii="TH Sarabun New" w:hAnsi="TH Sarabun New" w:cs="TH Sarabun New"/>
@@ -6972,16 +6956,7 @@
           <w:sz w:val="32"/>
           <w:szCs w:val="32"/>
         </w:rPr>
-        <w:t>{</w:t>
-      </w:r>
-      <w:proofErr w:type="gramEnd"/>
-      <w:r>
-        <w:rPr>
-          <w:rFonts w:ascii="TH Sarabun New" w:hAnsi="TH Sarabun New" w:cs="TH Sarabun New"/>
-          <w:sz w:val="32"/>
-          <w:szCs w:val="32"/>
-        </w:rPr>
-        <w:t>{assoc_m3_q2}}</w:t>
+        <w:t/>
       </w:r>
       <w:r>
         <w:rPr>
@@ -7260,7 +7235,7 @@
           <w:sz w:val="32"/>
           <w:szCs w:val="32"/>
         </w:rPr>
-        <w:t>fds</w:t>
+        <w:t/>
       </w:r>
       <w:r>
         <w:rPr>
@@ -7313,7 +7288,7 @@
           <w:sz w:val="32"/>
           <w:szCs w:val="32"/>
         </w:rPr>
-        <w:t xml:space="preserve">fdsf </w:t>
+        <w:t xml:space="preserve"> </w:t>
       </w:r>
       <w:r>
         <w:rPr>
@@ -7385,7 +7360,7 @@
           <w:sz w:val="32"/>
           <w:szCs w:val="32"/>
         </w:rPr>
-        <w:t>dsfdsfd</w:t>
+        <w:t/>
       </w:r>
     </w:p>
     <w:p>
@@ -7514,15 +7489,6 @@
         </w:rPr>
         <w:t/>
       </w:r>
-      <w:proofErr w:type="gramStart"/>
-      <w:r>
-        <w:rPr>
-          <w:rFonts w:ascii="TH Sarabun New" w:hAnsi="TH Sarabun New" w:cs="TH Sarabun New"/>
-          <w:sz w:val="32"/>
-          <w:szCs w:val="32"/>
-        </w:rPr>
-        <w:t/>
-      </w:r>
       <w:r>
         <w:rPr>
           <w:rFonts w:ascii="TH Sarabun New" w:hAnsi="TH Sarabun New" w:cs="TH Sarabun New"/>
@@ -7541,15 +7507,6 @@
         </w:rPr>
         <w:t xml:space="preserve"> </w:t>
       </w:r>
-      <w:r>
-        <w:rPr>
-          <w:rFonts w:ascii="TH Sarabun New" w:hAnsi="TH Sarabun New" w:cs="TH Sarabun New"/>
-          <w:sz w:val="32"/>
-          <w:szCs w:val="32"/>
-        </w:rPr>
-        <w:t/>
-      </w:r>
-      <w:proofErr w:type="gramEnd"/>
       <w:r>
         <w:rPr>
           <w:rFonts w:ascii="TH Sarabun New" w:hAnsi="TH Sarabun New" w:cs="TH Sarabun New"/>
@@ -7874,40 +7831,40 @@
           <w:sz w:val="32"/>
           <w:szCs w:val="32"/>
         </w:rPr>
-        <w:t>das</w:t>
-      </w:r>
-      <w:r>
-        <w:rPr>
-          <w:rFonts w:ascii="TH Sarabun New" w:hAnsi="TH Sarabun New" w:cs="TH Sarabun New"/>
-          <w:sz w:val="32"/>
-          <w:szCs w:val="32"/>
-        </w:rPr>
-        <w:t/>
-      </w:r>
-      <w:r>
-        <w:rPr>
-          <w:rFonts w:ascii="TH Sarabun New" w:hAnsi="TH Sarabun New" w:cs="TH Sarabun New"/>
-          <w:sz w:val="32"/>
-          <w:szCs w:val="32"/>
-        </w:rPr>
-        <w:t/>
-      </w:r>
-      <w:r>
-        <w:rPr>
-          <w:rFonts w:ascii="TH Sarabun New" w:hAnsi="TH Sarabun New" w:cs="TH Sarabun New"/>
-          <w:sz w:val="32"/>
-          <w:szCs w:val="32"/>
-          <w:cs/>
-        </w:rPr>
-        <w:t xml:space="preserve"> </w:t>
-      </w:r>
-      <w:r>
-        <w:rPr>
-          <w:rFonts w:ascii="TH Sarabun New" w:hAnsi="TH Sarabun New" w:cs="TH Sarabun New"/>
-          <w:sz w:val="32"/>
-          <w:szCs w:val="32"/>
-        </w:rPr>
-        <w:t>dd</w:t>
+        <w:t>๑</w:t>
+      </w:r>
+      <w:r>
+        <w:rPr>
+          <w:rFonts w:ascii="TH Sarabun New" w:hAnsi="TH Sarabun New" w:cs="TH Sarabun New"/>
+          <w:sz w:val="32"/>
+          <w:szCs w:val="32"/>
+        </w:rPr>
+        <w:t/>
+      </w:r>
+      <w:r>
+        <w:rPr>
+          <w:rFonts w:ascii="TH Sarabun New" w:hAnsi="TH Sarabun New" w:cs="TH Sarabun New"/>
+          <w:sz w:val="32"/>
+          <w:szCs w:val="32"/>
+        </w:rPr>
+        <w:t/>
+      </w:r>
+      <w:r>
+        <w:rPr>
+          <w:rFonts w:ascii="TH Sarabun New" w:hAnsi="TH Sarabun New" w:cs="TH Sarabun New"/>
+          <w:sz w:val="32"/>
+          <w:szCs w:val="32"/>
+          <w:cs/>
+        </w:rPr>
+        <w:t xml:space="preserve"> </w:t>
+      </w:r>
+      <w:r>
+        <w:rPr>
+          <w:rFonts w:ascii="TH Sarabun New" w:hAnsi="TH Sarabun New" w:cs="TH Sarabun New"/>
+          <w:sz w:val="32"/>
+          <w:szCs w:val="32"/>
+        </w:rPr>
+        <w:t>ไกกไ</w:t>
       </w:r>
       <w:r>
         <w:rPr>
@@ -7990,7 +7947,6 @@
         </w:rPr>
         <w:t/>
       </w:r>
-      <w:proofErr w:type="gramStart"/>
       <w:r>
         <w:rPr>
           <w:rFonts w:ascii="TH Sarabun New" w:hAnsi="TH Sarabun New" w:cs="TH Sarabun New"/>
@@ -8008,7 +7964,6 @@
         </w:rPr>
         <w:t xml:space="preserve">  ไม่เคยใช้</w:t>
       </w:r>
-      <w:proofErr w:type="gramEnd"/>
     </w:p>
     <w:p>
       <w:pPr>
@@ -8037,7 +7992,6 @@
         </w:rPr>
         <w:t/>
       </w:r>
-      <w:proofErr w:type="gramStart"/>
       <w:r>
         <w:rPr>
           <w:rFonts w:ascii="TH Sarabun New" w:hAnsi="TH Sarabun New" w:cs="TH Sarabun New"/>
@@ -8064,7 +8018,6 @@
         </w:rPr>
         <w:t>เคยใช้</w:t>
       </w:r>
-      <w:proofErr w:type="gramEnd"/>
       <w:r>
         <w:rPr>
           <w:rFonts w:ascii="TH Sarabun New" w:hAnsi="TH Sarabun New" w:cs="TH Sarabun New"/>
@@ -8099,17 +8052,7 @@
           <w:szCs w:val="32"/>
           <w:cs/>
         </w:rPr>
-        <w:t>พ.</w:t>
-      </w:r>
-      <w:proofErr w:type="gramStart"/>
-      <w:r>
-        <w:rPr>
-          <w:rFonts w:ascii="TH Sarabun New" w:hAnsi="TH Sarabun New" w:cs="TH Sarabun New"/>
-          <w:sz w:val="32"/>
-          <w:szCs w:val="32"/>
-          <w:cs/>
-        </w:rPr>
-        <w:t>ศ</w:t>
+        <w:t>พ.ศ</w:t>
       </w:r>
       <w:r>
         <w:rPr>
@@ -8126,16 +8069,7 @@
           <w:sz w:val="32"/>
           <w:szCs w:val="32"/>
         </w:rPr>
-        <w:t>sa </w:t>
-      </w:r>
-      <w:proofErr w:type="gramEnd"/>
-      <w:r>
-        <w:rPr>
-          <w:rFonts w:ascii="TH Sarabun New" w:hAnsi="TH Sarabun New" w:cs="TH Sarabun New"/>
-          <w:sz w:val="32"/>
-          <w:szCs w:val="32"/>
-        </w:rPr>
-        <w:t/>
+        <w:t>กกไไก </w:t>
       </w:r>
       <w:r>
         <w:rPr>
@@ -8168,7 +8102,7 @@
           <w:sz w:val="32"/>
           <w:szCs w:val="32"/>
         </w:rPr>
-        <w:t>das</w:t>
+        <w:t>กไไก</w:t>
       </w:r>
       <w:r>
         <w:rPr>
@@ -8315,40 +8249,40 @@
           <w:sz w:val="32"/>
           <w:szCs w:val="32"/>
         </w:rPr>
-        <w:t>das</w:t>
-      </w:r>
-      <w:r>
-        <w:rPr>
-          <w:rFonts w:ascii="TH Sarabun New" w:hAnsi="TH Sarabun New" w:cs="TH Sarabun New"/>
-          <w:sz w:val="32"/>
-          <w:szCs w:val="32"/>
-        </w:rPr>
-        <w:t/>
-      </w:r>
-      <w:r>
-        <w:rPr>
-          <w:rFonts w:ascii="TH Sarabun New" w:hAnsi="TH Sarabun New" w:cs="TH Sarabun New"/>
-          <w:sz w:val="32"/>
-          <w:szCs w:val="32"/>
-        </w:rPr>
-        <w:t/>
-      </w:r>
-      <w:r>
-        <w:rPr>
-          <w:rFonts w:ascii="TH Sarabun New" w:hAnsi="TH Sarabun New" w:cs="TH Sarabun New"/>
-          <w:sz w:val="32"/>
-          <w:szCs w:val="32"/>
-          <w:cs/>
-        </w:rPr>
-        <w:t xml:space="preserve"> </w:t>
-      </w:r>
-      <w:r>
-        <w:rPr>
-          <w:rFonts w:ascii="TH Sarabun New" w:hAnsi="TH Sarabun New" w:cs="TH Sarabun New"/>
-          <w:sz w:val="32"/>
-          <w:szCs w:val="32"/>
-        </w:rPr>
-        <w:t>d</w:t>
+        <w:t>๑</w:t>
+      </w:r>
+      <w:r>
+        <w:rPr>
+          <w:rFonts w:ascii="TH Sarabun New" w:hAnsi="TH Sarabun New" w:cs="TH Sarabun New"/>
+          <w:sz w:val="32"/>
+          <w:szCs w:val="32"/>
+        </w:rPr>
+        <w:t/>
+      </w:r>
+      <w:r>
+        <w:rPr>
+          <w:rFonts w:ascii="TH Sarabun New" w:hAnsi="TH Sarabun New" w:cs="TH Sarabun New"/>
+          <w:sz w:val="32"/>
+          <w:szCs w:val="32"/>
+        </w:rPr>
+        <w:t/>
+      </w:r>
+      <w:r>
+        <w:rPr>
+          <w:rFonts w:ascii="TH Sarabun New" w:hAnsi="TH Sarabun New" w:cs="TH Sarabun New"/>
+          <w:sz w:val="32"/>
+          <w:szCs w:val="32"/>
+          <w:cs/>
+        </w:rPr>
+        <w:t xml:space="preserve"> </w:t>
+      </w:r>
+      <w:r>
+        <w:rPr>
+          <w:rFonts w:ascii="TH Sarabun New" w:hAnsi="TH Sarabun New" w:cs="TH Sarabun New"/>
+          <w:sz w:val="32"/>
+          <w:szCs w:val="32"/>
+        </w:rPr>
+        <w:t>กกไไ</w:t>
       </w:r>
       <w:r>
         <w:rPr>
@@ -8485,7 +8419,6 @@
         </w:rPr>
         <w:t/>
       </w:r>
-      <w:proofErr w:type="gramStart"/>
       <w:r>
         <w:rPr>
           <w:rFonts w:ascii="TH Sarabun New" w:hAnsi="TH Sarabun New" w:cs="TH Sarabun New"/>
@@ -8503,7 +8436,6 @@
         </w:rPr>
         <w:t xml:space="preserve">  ไม่เคยใช้</w:t>
       </w:r>
-      <w:proofErr w:type="gramEnd"/>
     </w:p>
     <w:p>
       <w:pPr>
@@ -8532,7 +8464,6 @@
         </w:rPr>
         <w:t/>
       </w:r>
-      <w:proofErr w:type="gramStart"/>
       <w:r>
         <w:rPr>
           <w:rFonts w:ascii="TH Sarabun New" w:hAnsi="TH Sarabun New" w:cs="TH Sarabun New"/>
@@ -8559,7 +8490,6 @@
         </w:rPr>
         <w:t>เคยใช้</w:t>
       </w:r>
-      <w:proofErr w:type="gramEnd"/>
       <w:r>
         <w:rPr>
           <w:rFonts w:ascii="TH Sarabun New" w:hAnsi="TH Sarabun New" w:cs="TH Sarabun New"/>
@@ -8594,17 +8524,7 @@
           <w:szCs w:val="32"/>
           <w:cs/>
         </w:rPr>
-        <w:t>พ.</w:t>
-      </w:r>
-      <w:proofErr w:type="gramStart"/>
-      <w:r>
-        <w:rPr>
-          <w:rFonts w:ascii="TH Sarabun New" w:hAnsi="TH Sarabun New" w:cs="TH Sarabun New"/>
-          <w:sz w:val="32"/>
-          <w:szCs w:val="32"/>
-          <w:cs/>
-        </w:rPr>
-        <w:t>ศ</w:t>
+        <w:t>พ.ศ</w:t>
       </w:r>
       <w:r>
         <w:rPr>
@@ -8621,16 +8541,7 @@
           <w:sz w:val="32"/>
           <w:szCs w:val="32"/>
         </w:rPr>
-        <w:t>sa</w:t>
-      </w:r>
-      <w:proofErr w:type="gramEnd"/>
-      <w:r>
-        <w:rPr>
-          <w:rFonts w:ascii="TH Sarabun New" w:hAnsi="TH Sarabun New" w:cs="TH Sarabun New"/>
-          <w:sz w:val="32"/>
-          <w:szCs w:val="32"/>
-        </w:rPr>
-        <w:t/>
+        <w:t>ไกไก</w:t>
       </w:r>
       <w:r>
         <w:rPr>
@@ -8672,7 +8583,7 @@
           <w:sz w:val="32"/>
           <w:szCs w:val="32"/>
         </w:rPr>
-        <w:t>das</w:t>
+        <w:t>ไกก</w:t>
       </w:r>
       <w:r>
         <w:rPr>
@@ -8763,40 +8674,40 @@
           <w:sz w:val="32"/>
           <w:szCs w:val="32"/>
         </w:rPr>
-        <w:t>dsa</w:t>
-      </w:r>
-      <w:r>
-        <w:rPr>
-          <w:rFonts w:ascii="TH Sarabun New" w:hAnsi="TH Sarabun New" w:cs="TH Sarabun New"/>
-          <w:sz w:val="32"/>
-          <w:szCs w:val="32"/>
-        </w:rPr>
-        <w:t/>
-      </w:r>
-      <w:r>
-        <w:rPr>
-          <w:rFonts w:ascii="TH Sarabun New" w:hAnsi="TH Sarabun New" w:cs="TH Sarabun New"/>
-          <w:sz w:val="32"/>
-          <w:szCs w:val="32"/>
-        </w:rPr>
-        <w:t/>
-      </w:r>
-      <w:r>
-        <w:rPr>
-          <w:rFonts w:ascii="TH Sarabun New" w:hAnsi="TH Sarabun New" w:cs="TH Sarabun New"/>
-          <w:sz w:val="32"/>
-          <w:szCs w:val="32"/>
-          <w:cs/>
-        </w:rPr>
-        <w:t xml:space="preserve"> </w:t>
-      </w:r>
-      <w:r>
-        <w:rPr>
-          <w:rFonts w:ascii="TH Sarabun New" w:hAnsi="TH Sarabun New" w:cs="TH Sarabun New"/>
-          <w:sz w:val="32"/>
-          <w:szCs w:val="32"/>
-        </w:rPr>
-        <w:t>d</w:t>
+        <w:t>๑</w:t>
+      </w:r>
+      <w:r>
+        <w:rPr>
+          <w:rFonts w:ascii="TH Sarabun New" w:hAnsi="TH Sarabun New" w:cs="TH Sarabun New"/>
+          <w:sz w:val="32"/>
+          <w:szCs w:val="32"/>
+        </w:rPr>
+        <w:t/>
+      </w:r>
+      <w:r>
+        <w:rPr>
+          <w:rFonts w:ascii="TH Sarabun New" w:hAnsi="TH Sarabun New" w:cs="TH Sarabun New"/>
+          <w:sz w:val="32"/>
+          <w:szCs w:val="32"/>
+        </w:rPr>
+        <w:t/>
+      </w:r>
+      <w:r>
+        <w:rPr>
+          <w:rFonts w:ascii="TH Sarabun New" w:hAnsi="TH Sarabun New" w:cs="TH Sarabun New"/>
+          <w:sz w:val="32"/>
+          <w:szCs w:val="32"/>
+          <w:cs/>
+        </w:rPr>
+        <w:t xml:space="preserve"> </w:t>
+      </w:r>
+      <w:r>
+        <w:rPr>
+          <w:rFonts w:ascii="TH Sarabun New" w:hAnsi="TH Sarabun New" w:cs="TH Sarabun New"/>
+          <w:sz w:val="32"/>
+          <w:szCs w:val="32"/>
+        </w:rPr>
+        <w:t>ไกไก</w:t>
       </w:r>
       <w:r>
         <w:rPr>
@@ -8880,7 +8791,6 @@
         </w:rPr>
         <w:t/>
       </w:r>
-      <w:proofErr w:type="gramStart"/>
       <w:r>
         <w:rPr>
           <w:rFonts w:ascii="TH Sarabun New" w:hAnsi="TH Sarabun New" w:cs="TH Sarabun New"/>
@@ -8898,7 +8808,6 @@
         </w:rPr>
         <w:t xml:space="preserve">  ไม่เคยใช้</w:t>
       </w:r>
-      <w:proofErr w:type="gramEnd"/>
     </w:p>
     <w:p>
       <w:pPr>
@@ -8927,7 +8836,6 @@
         </w:rPr>
         <w:t/>
       </w:r>
-      <w:proofErr w:type="gramStart"/>
       <w:r>
         <w:rPr>
           <w:rFonts w:ascii="TH Sarabun New" w:hAnsi="TH Sarabun New" w:cs="TH Sarabun New"/>
@@ -8954,7 +8862,6 @@
         </w:rPr>
         <w:t>เคยใช้</w:t>
       </w:r>
-      <w:proofErr w:type="gramEnd"/>
       <w:r>
         <w:rPr>
           <w:rFonts w:ascii="TH Sarabun New" w:hAnsi="TH Sarabun New" w:cs="TH Sarabun New"/>
@@ -8989,17 +8896,7 @@
           <w:szCs w:val="32"/>
           <w:cs/>
         </w:rPr>
-        <w:t>พ.</w:t>
-      </w:r>
-      <w:proofErr w:type="gramStart"/>
-      <w:r>
-        <w:rPr>
-          <w:rFonts w:ascii="TH Sarabun New" w:hAnsi="TH Sarabun New" w:cs="TH Sarabun New"/>
-          <w:sz w:val="32"/>
-          <w:szCs w:val="32"/>
-          <w:cs/>
-        </w:rPr>
-        <w:t>ศ</w:t>
+        <w:t>พ.ศ</w:t>
       </w:r>
       <w:r>
         <w:rPr>
@@ -9016,16 +8913,7 @@
           <w:sz w:val="32"/>
           <w:szCs w:val="32"/>
         </w:rPr>
-        <w:t>sad</w:t>
-      </w:r>
-      <w:proofErr w:type="gramEnd"/>
-      <w:r>
-        <w:rPr>
-          <w:rFonts w:ascii="TH Sarabun New" w:hAnsi="TH Sarabun New" w:cs="TH Sarabun New"/>
-          <w:sz w:val="32"/>
-          <w:szCs w:val="32"/>
-        </w:rPr>
-        <w:t/>
+        <w:t>กไกไกไก</w:t>
       </w:r>
       <w:r>
         <w:rPr>
@@ -9067,7 +8955,7 @@
           <w:sz w:val="32"/>
           <w:szCs w:val="32"/>
         </w:rPr>
-        <w:t>sa</w:t>
+        <w:t>กไกไ</w:t>
       </w:r>
       <w:r>
         <w:rPr>
@@ -9225,17 +9113,8 @@
           <w:sz w:val="32"/>
           <w:szCs w:val="32"/>
         </w:rPr>
-        <w:t>d</w:t>
-      </w:r>
-      <w:r>
-        <w:rPr>
-          <w:rFonts w:ascii="TH Sarabun New" w:hAnsi="TH Sarabun New" w:cs="TH Sarabun New"/>
-          <w:sz w:val="32"/>
-          <w:szCs w:val="32"/>
-        </w:rPr>
-        <w:t/>
-      </w:r>
-      <w:proofErr w:type="gramStart"/>
+        <w:t>แหแห</w:t>
+      </w:r>
       <w:r>
         <w:rPr>
           <w:rFonts w:ascii="TH Sarabun New" w:hAnsi="TH Sarabun New" w:cs="TH Sarabun New"/>
@@ -9276,16 +9155,7 @@
           <w:sz w:val="32"/>
           <w:szCs w:val="32"/>
         </w:rPr>
-        <w:t>sa</w:t>
-      </w:r>
-      <w:proofErr w:type="gramEnd"/>
-      <w:r>
-        <w:rPr>
-          <w:rFonts w:ascii="TH Sarabun New" w:hAnsi="TH Sarabun New" w:cs="TH Sarabun New"/>
-          <w:sz w:val="32"/>
-          <w:szCs w:val="32"/>
-        </w:rPr>
-        <w:t/>
+        <w:t>หแหแ</w:t>
       </w:r>
       <w:r>
         <w:rPr>
@@ -9412,15 +9282,6 @@
         </w:rPr>
         <w:t/>
       </w:r>
-      <w:proofErr w:type="gramStart"/>
-      <w:r>
-        <w:rPr>
-          <w:rFonts w:ascii="TH Sarabun New" w:hAnsi="TH Sarabun New" w:cs="TH Sarabun New"/>
-          <w:sz w:val="32"/>
-          <w:szCs w:val="32"/>
-        </w:rPr>
-        <w:t/>
-      </w:r>
       <w:r>
         <w:rPr>
           <w:rFonts w:ascii="TH Sarabun New" w:hAnsi="TH Sarabun New" w:cs="TH Sarabun New"/>
@@ -9447,7 +9308,6 @@
         </w:rPr>
         <w:t>Quartile</w:t>
       </w:r>
-      <w:proofErr w:type="gramEnd"/>
       <w:r>
         <w:rPr>
           <w:rFonts w:ascii="TH Sarabun New" w:hAnsi="TH Sarabun New" w:cs="TH Sarabun New"/>
@@ -9457,7 +9317,6 @@
         </w:rPr>
         <w:t xml:space="preserve">1 </w:t>
       </w:r>
-      <w:proofErr w:type="gramStart"/>
       <w:r>
         <w:rPr>
           <w:rFonts w:ascii="TH Sarabun New" w:hAnsi="TH Sarabun New" w:cs="TH Sarabun New"/>
@@ -9474,16 +9333,7 @@
           <w:sz w:val="32"/>
           <w:szCs w:val="32"/>
         </w:rPr>
-        <w:t>{</w:t>
-      </w:r>
-      <w:proofErr w:type="gramEnd"/>
-      <w:r>
-        <w:rPr>
-          <w:rFonts w:ascii="TH Sarabun New" w:hAnsi="TH Sarabun New" w:cs="TH Sarabun New"/>
-          <w:sz w:val="32"/>
-          <w:szCs w:val="32"/>
-        </w:rPr>
-        <w:t>{prof_m3_q2}}</w:t>
+        <w:t/>
       </w:r>
       <w:r>
         <w:rPr>
@@ -9739,7 +9589,7 @@
           <w:sz w:val="32"/>
           <w:szCs w:val="32"/>
         </w:rPr>
-        <w:t>dsa</w:t>
+        <w:t>หแห</w:t>
       </w:r>
       <w:r>
         <w:rPr>
@@ -9794,7 +9644,7 @@
           <w:sz w:val="32"/>
           <w:szCs w:val="32"/>
         </w:rPr>
-        <w:t>das</w:t>
+        <w:t>หแห</w:t>
       </w:r>
       <w:r>
         <w:rPr>
@@ -9873,7 +9723,7 @@
           <w:sz w:val="32"/>
           <w:szCs w:val="32"/>
         </w:rPr>
-        <w:t/>
+        <w:t>หแห</w:t>
       </w:r>
     </w:p>
     <w:p>
@@ -10032,15 +9882,6 @@
         </w:rPr>
         <w:t/>
       </w:r>
-      <w:proofErr w:type="gramStart"/>
-      <w:r>
-        <w:rPr>
-          <w:rFonts w:ascii="TH Sarabun New" w:hAnsi="TH Sarabun New" w:cs="TH Sarabun New"/>
-          <w:sz w:val="32"/>
-          <w:szCs w:val="32"/>
-        </w:rPr>
-        <w:t/>
-      </w:r>
       <w:r>
         <w:rPr>
           <w:rFonts w:ascii="TH Sarabun New" w:hAnsi="TH Sarabun New" w:cs="TH Sarabun New"/>
@@ -10059,15 +9900,6 @@
         </w:rPr>
         <w:t xml:space="preserve"> </w:t>
       </w:r>
-      <w:r>
-        <w:rPr>
-          <w:rFonts w:ascii="TH Sarabun New" w:hAnsi="TH Sarabun New" w:cs="TH Sarabun New"/>
-          <w:sz w:val="32"/>
-          <w:szCs w:val="32"/>
-        </w:rPr>
-        <w:t/>
-      </w:r>
-      <w:proofErr w:type="gramEnd"/>
       <w:r>
         <w:rPr>
           <w:rFonts w:ascii="TH Sarabun New" w:hAnsi="TH Sarabun New" w:cs="TH Sarabun New"/>
@@ -10402,7 +10234,7 @@
           <w:sz w:val="32"/>
           <w:szCs w:val="32"/>
         </w:rPr>
-        <w:t>นายโจ จิ</w:t>
+        <w:t>นายeee3ปป</w:t>
       </w:r>
       <w:r>
         <w:rPr>
@@ -10439,7 +10271,7 @@
           <w:sz w:val="32"/>
           <w:szCs w:val="32"/>
         </w:rPr>
-        <w:t>dsa</w:t>
+        <w:t>ผู้ช่วยศาสตราจารย์</w:t>
       </w:r>
     </w:p>
     <w:p>
@@ -10477,7 +10309,7 @@
           <w:sz w:val="32"/>
           <w:szCs w:val="32"/>
         </w:rPr>
-        <w:t>วันที่ ๒๖ มีนาคม พ.ศ. ๒๕๖๙</w:t>
+        <w:t>วันที่ ๙ เมษายน พ.ศ. ๒๕๖๙</w:t>
       </w:r>
     </w:p>
     <w:sectPr>

</xml_diff>